<commit_message>
Audit Part B: humanize tone, follow REGLER, update MY_SUBMISSIONS_Prep + STUDY_SUMMARY
</commit_message>
<xml_diff>
--- a/engelska/BM_PREP/MY_SUBMISSIONS_Prep.docx
+++ b/engelska/BM_PREP/MY_SUBMISSIONS_Prep.docx
@@ -808,7 +808,180 @@
           <w:color w:val="226622"/>
           <w:sz w:val="18"/>
         </w:rPr>
-        <w:t>-&gt; Nothing submitted yet. Be honest. Mention theme, character, quote if you can.</w:t>
+        <w:t>-&gt; Klara and the Sun (Ishiguro). Submitted Part B first draft. Thesis: a person can't be copied; what makes Josie "Josie" lives in the people who love her, not inside her body. PEEL x3: (1) Capaldi's plan fails on its own logic - "Nothing inside Josie that's beyond the Klaras of this world to continue" p.224. (2) Klara in the Yard - "something very special, but it wasn't inside Josie. It was inside those who loved her" p.306. (3) Rick + lifting system - "Whatever happens, you and me, we'll always be together" p.173.</w:t>
+      </w:r>
+    </w:p>
+    <w:p>
+      <w:pPr>
+        <w:pStyle w:val="Heading1"/>
+        <w:spacing w:before="120" w:after="40"/>
+      </w:pPr>
+      <w:r>
+        <w:rPr>
+          <w:color w:val="C0392B"/>
+          <w:sz w:val="22"/>
+        </w:rPr>
+        <w:t>A4 - Community Voices (UK Stereotypes) - Parts A &amp; B</w:t>
+      </w:r>
+    </w:p>
+    <w:p>
+      <w:pPr>
+        <w:spacing w:after="40" w:before="20"/>
+      </w:pPr>
+      <w:r>
+        <w:rPr>
+          <w:b/>
+          <w:sz w:val="18"/>
+        </w:rPr>
+        <w:t>Q: Part A topic?</w:t>
+        <w:br/>
+      </w:r>
+      <w:r>
+        <w:rPr>
+          <w:color w:val="226622"/>
+          <w:sz w:val="18"/>
+        </w:rPr>
+        <w:t>-&gt; Argumentative speech, 5-6 min. UK audience. Topic 1: breaking down cultural stereotypes. Refuted "stereotypes are just harmless jokes."</w:t>
+      </w:r>
+    </w:p>
+    <w:p>
+      <w:pPr>
+        <w:spacing w:after="40" w:before="20"/>
+      </w:pPr>
+      <w:r>
+        <w:rPr>
+          <w:b/>
+          <w:sz w:val="18"/>
+        </w:rPr>
+        <w:t>Q: Part A 3 points?</w:t>
+        <w:br/>
+      </w:r>
+      <w:r>
+        <w:rPr>
+          <w:color w:val="226622"/>
+          <w:sz w:val="18"/>
+        </w:rPr>
+        <w:t>-&gt; (1) Stereotypes pull people apart - Lesson 13 Open Letter to Fellow Students. (2) We already know what helps - Lesson 14 critical reading method. (3) Local leaders matter - UK Gov Ethnicity facts and figures.</w:t>
+      </w:r>
+    </w:p>
+    <w:p>
+      <w:pPr>
+        <w:spacing w:after="40" w:before="20"/>
+      </w:pPr>
+      <w:r>
+        <w:rPr>
+          <w:b/>
+          <w:sz w:val="18"/>
+        </w:rPr>
+        <w:t>Q: Part A sources?</w:t>
+        <w:br/>
+      </w:r>
+      <w:r>
+        <w:rPr>
+          <w:color w:val="226622"/>
+          <w:sz w:val="18"/>
+        </w:rPr>
+        <w:t>-&gt; Lesson 13 (Open Letter, Two Kinds, Jaymee's Extended Break). Lesson 14 (To My Old Master, School Shooters, Black American Culture). UK Government Ethnicity facts and figures.</w:t>
+      </w:r>
+    </w:p>
+    <w:p>
+      <w:pPr>
+        <w:spacing w:after="40" w:before="20"/>
+      </w:pPr>
+      <w:r>
+        <w:rPr>
+          <w:b/>
+          <w:sz w:val="18"/>
+        </w:rPr>
+        <w:t>Q: Part B novel + thesis?</w:t>
+        <w:br/>
+      </w:r>
+      <w:r>
+        <w:rPr>
+          <w:color w:val="226622"/>
+          <w:sz w:val="18"/>
+        </w:rPr>
+        <w:t>-&gt; Klara and the Sun by Kazuo Ishiguro. Thesis (~65 words): a person can't be copied even with perfect tech; what makes Josie unique sits in the people who love her, not inside her body.</w:t>
+      </w:r>
+    </w:p>
+    <w:p>
+      <w:pPr>
+        <w:spacing w:after="40" w:before="20"/>
+      </w:pPr>
+      <w:r>
+        <w:rPr>
+          <w:b/>
+          <w:sz w:val="18"/>
+        </w:rPr>
+        <w:t>Q: Part B PEEL 1 - Capaldi?</w:t>
+        <w:br/>
+      </w:r>
+      <w:r>
+        <w:rPr>
+          <w:color w:val="226622"/>
+          <w:sz w:val="18"/>
+        </w:rPr>
+        <w:t>-&gt; Capaldi believes the replica will work. Quote p.224: "Nothing inside Josie that's beyond the Klaras of this world to continue." Plan fails on its own logic - even the Mother doesn't really believe she could love a copy.</w:t>
+      </w:r>
+    </w:p>
+    <w:p>
+      <w:pPr>
+        <w:spacing w:after="40" w:before="20"/>
+      </w:pPr>
+      <w:r>
+        <w:rPr>
+          <w:b/>
+          <w:sz w:val="18"/>
+        </w:rPr>
+        <w:t>Q: Part B PEEL 2 - Klara in the Yard?</w:t>
+        <w:br/>
+      </w:r>
+      <w:r>
+        <w:rPr>
+          <w:color w:val="226622"/>
+          <w:sz w:val="18"/>
+        </w:rPr>
+        <w:t>-&gt; Klara herself rejects the copy idea by the end. Quote p.306: "There was something very special, but it wasn't inside Josie. It was inside those who loved her." The "specialness" is relational.</w:t>
+      </w:r>
+    </w:p>
+    <w:p>
+      <w:pPr>
+        <w:spacing w:after="40" w:before="20"/>
+      </w:pPr>
+      <w:r>
+        <w:rPr>
+          <w:b/>
+          <w:sz w:val="18"/>
+        </w:rPr>
+        <w:t>Q: Part B PEEL 3 - Rick?</w:t>
+        <w:br/>
+      </w:r>
+      <w:r>
+        <w:rPr>
+          <w:color w:val="226622"/>
+          <w:sz w:val="18"/>
+        </w:rPr>
+        <w:t>-&gt; Lifting system locates worth in genes - same mistake Capaldi makes. Quote p.173: "Whatever happens, you and me, we'll always be together." Rick's value lives in bonds (Josie, his mum, Klara).</w:t>
+      </w:r>
+    </w:p>
+    <w:p>
+      <w:pPr>
+        <w:spacing w:after="40" w:before="20"/>
+      </w:pPr>
+      <w:r>
+        <w:rPr>
+          <w:b/>
+          <w:sz w:val="18"/>
+        </w:rPr>
+        <w:t>Q: Part B word count?</w:t>
+        <w:br/>
+      </w:r>
+      <w:r>
+        <w:rPr>
+          <w:color w:val="226622"/>
+          <w:sz w:val="18"/>
+        </w:rPr>
+        <w:t>-&gt; 619 words total. Thesis 64. Bodies 177 / 183 / 189. Within 500-675. No intro, no conclusion (per brief).</w:t>
       </w:r>
     </w:p>
     <w:p>

</xml_diff>

<commit_message>
Part B: replace fabricated quotes with verified citations (Klara and the Sun)
</commit_message>
<xml_diff>
--- a/engelska/BM_PREP/MY_SUBMISSIONS_Prep.docx
+++ b/engelska/BM_PREP/MY_SUBMISSIONS_Prep.docx
@@ -808,7 +808,7 @@
           <w:color w:val="226622"/>
           <w:sz w:val="18"/>
         </w:rPr>
-        <w:t>-&gt; Klara and the Sun (Ishiguro). Submitted Part B first draft. Thesis: a person can't be copied; what makes Josie "Josie" lives in the people who love her, not inside her body. PEEL x3: (1) Capaldi's plan fails on its own logic - "Nothing inside Josie that's beyond the Klaras of this world to continue" p.224. (2) Klara in the Yard - "something very special, but it wasn't inside Josie. It was inside those who loved her" p.306. (3) Rick + lifting system - "Whatever happens, you and me, we'll always be together" p.173.</w:t>
+        <w:t>-&gt; Klara and the Sun (Ishiguro, Faber 2021). Submitted Part B first draft. Thesis: a person can't be copied; what makes Josie "Josie" lives in the people who love her, not inside her body. PEEL x3: (1) Replica face fails on its own - "The face looked disappointed and afraid" p.201. (2) Klara in the Yard - "something very special, but it wasn't inside Josie. It was inside those who loved her" (end of Part 6). (3) Rick + lifting system - "I don't belong here. This is a meeting for lifted kids" p.82.</w:t>
       </w:r>
     </w:p>
     <w:p>
@@ -913,7 +913,7 @@
           <w:b/>
           <w:sz w:val="18"/>
         </w:rPr>
-        <w:t>Q: Part B PEEL 1 - Capaldi?</w:t>
+        <w:t>Q: Part B PEEL 1 - Capaldi / replica?</w:t>
         <w:br/>
       </w:r>
       <w:r>
@@ -921,7 +921,7 @@
           <w:color w:val="226622"/>
           <w:sz w:val="18"/>
         </w:rPr>
-        <w:t>-&gt; Capaldi believes the replica will work. Quote p.224: "Nothing inside Josie that's beyond the Klaras of this world to continue." Plan fails on its own logic - even the Mother doesn't really believe she could love a copy.</w:t>
+        <w:t>-&gt; Capaldi believes the replica will work. Klara sees the model in his studio and the copy fails on its own. Quote p.201: "Her face was very like that of the real Josie, but ... The face looked disappointed and afraid." Even the Mother doesn't really believe she could love it.</w:t>
       </w:r>
     </w:p>
     <w:p>
@@ -941,7 +941,7 @@
           <w:color w:val="226622"/>
           <w:sz w:val="18"/>
         </w:rPr>
-        <w:t>-&gt; Klara herself rejects the copy idea by the end. Quote p.306: "There was something very special, but it wasn't inside Josie. It was inside those who loved her." The "specialness" is relational.</w:t>
+        <w:t>-&gt; Klara herself rejects the copy idea at the end. Quote (end of Part 6, talking to Manager): "There was something very special, but it wasn't inside Josie. It was inside those who loved her." The "specialness" is relational, not inside the body.</w:t>
       </w:r>
     </w:p>
     <w:p>
@@ -961,7 +961,7 @@
           <w:color w:val="226622"/>
           <w:sz w:val="18"/>
         </w:rPr>
-        <w:t>-&gt; Lifting system locates worth in genes - same mistake Capaldi makes. Quote p.173: "Whatever happens, you and me, we'll always be together." Rick's value lives in bonds (Josie, his mum, Klara).</w:t>
+        <w:t>-&gt; Lifting system locates worth in genes - same mistake Capaldi makes. Quote p.82 (interaction meeting): "I don't belong here. This is a meeting for lifted kids." Rick's value lives in bonds (Josie, his mum, Klara), not inside his genes.</w:t>
       </w:r>
     </w:p>
     <w:p>

</xml_diff>